<commit_message>
Portal: reteste da água do CQ (DV-CQ-001 e 008 resolvidos no ambiente, DV-CQ-009 e 019 confirmados na água), Relatório de Testes 1.3 e Words 1.1, 51 conclusivos de 63
Co-Authored-By: Claude Sonnet 5.5 <noreply@anthropic.com>
Claude-Session: https://claude.ai/code/session_016ZyaVQ3Fat8knNf78iQG9U
</commit_message>
<xml_diff>
--- a/documentacao/arquivos/controle-qualidade/LabMedSys - Modulo Controle da Qualidade - Análise e Laudo - Visao Geral.docx
+++ b/documentacao/arquivos/controle-qualidade/LabMedSys - Modulo Controle da Qualidade - Análise e Laudo - Visao Geral.docx
@@ -946,7 +946,7 @@
               <w:rPr>
                 <w:szCs w:val="20"/>
               </w:rPr>
-              <w:t>30/10/2026</w:t>
+              <w:t>03/11/2026</w:t>
             </w:r>
           </w:p>
         </w:tc>
@@ -4448,7 +4448,7 @@
         <w:rPr>
           <w:szCs w:val="20"/>
         </w:rPr>
-        <w:t xml:space="preserve"> o fluxo completo de ambiente e água (bloqueado pelo DV-CQ-008), a etiqueta com laudo reprovado, a relação de resultados de outras análises na Emissão Laudo Final e as fases A, B, C, E, F e G da rodada 2.</w:t>
+        <w:t xml:space="preserve"> o fluxo completo de ambiente e água (a água chega à análise desde 03/11/2026, mas o resultado não grava, DV-CQ-009), a etiqueta com laudo reprovado, a relação de resultados de outras análises na Emissão Laudo Final e as fases A, B, C, E, F e G da rodada 2.</w:t>
       </w:r>
     </w:p>
     <w:p>

</xml_diff>